<commit_message>
InfoQ CADEC article: references verified against arXiv and Crossref; CADEC entry gains its page range, CONORM entry uses the preprint's exact title
All five are real and each is cited once in the body. Word version regenerated.

Co-Authored-By: Claude Fable 5.1 <noreply@anthropic.com>
</commit_message>
<xml_diff>
--- a/docs/article-infoq-CADEC.docx
+++ b/docs/article-infoq-CADEC.docx
@@ -3568,7 +3568,7 @@
         <w:t xml:space="preserve">Cadec: A corpus of adverse drug event annotations</w:t>
       </w:r>
       <w:r>
-        <w:t xml:space="preserve">, Journal of Biomedical Informatics 55, 2015. doi.org/10.1016/j.jbi.2015.03.010</w:t>
+        <w:t xml:space="preserve">, Journal of Biomedical Informatics 55, 73–81, 2015. doi.org/10.1016/j.jbi.2015.03.010</w:t>
       </w:r>
     </w:p>
     <w:p>
@@ -3590,13 +3590,10 @@
           <w:i/>
           <w:iCs/>
         </w:rPr>
-        <w:t xml:space="preserve">Context-Aware Entity Normalization for Adverse Drug Event Detection</w:t>
-      </w:r>
-      <w:r>
-        <w:t xml:space="preserve"> </w:t>
-      </w:r>
-      <w:r>
-        <w:t xml:space="preserve">(CONORM), medRxiv 2023. doi.org/10.1101/2023.09.26.23296150</w:t>
+        <w:t xml:space="preserve">CONORM: Context-Aware Entity Normalization for Adverse Drug Event Detection</w:t>
+      </w:r>
+      <w:r>
+        <w:t xml:space="preserve">, medRxiv preprint, 2023. doi.org/10.1101/2023.09.26.23296150</w:t>
       </w:r>
     </w:p>
     <w:bookmarkEnd w:id="28"/>

</xml_diff>

<commit_message>
InfoQ CADEC article: two wording fixes the regenerated report showed — "after voting" on the top row, "about five points" for the loose check
The table's top row is the record set after rung 3, not the extractor alone
(one record apart on every draw); the loose check trails shipping everything by
5.2 F1 points, not "within five". Word version regenerated with the recorded
pandoc command. No number changed.

Co-Authored-By: Claude Fable 5.1 <noreply@anthropic.com>
</commit_message>
<xml_diff>
--- a/docs/article-infoq-CADEC.docx
+++ b/docs/article-infoq-CADEC.docx
@@ -1942,7 +1942,7 @@
               <w:pStyle w:val="Compact"/>
             </w:pPr>
             <w:r>
-              <w:t xml:space="preserve">the extractor says so: everything</w:t>
+              <w:t xml:space="preserve">the extractor says so: everything, after voting</w:t>
             </w:r>
           </w:p>
         </w:tc>
@@ -2604,7 +2604,7 @@
         <w:pStyle w:val="BodyText"/>
       </w:pPr>
       <w:r>
-        <w:t xml:space="preserve">Filter on any verdict and accuracy rises above the 0.39 of shipping everything, so the paid verdicts were not noise, and every row ships fewer correct answers, because every one withholds. F1 sees both sides. ACCEPT and strict voting give up eleven and six points of it to send half or more of the batch to a person; the loose check, loose voting and the blind judge land within five points of shipping everything; only the menu-shown judge clears it, by two to three points on every run, for 84,000 tokens.</w:t>
+        <w:t xml:space="preserve">Filter on any verdict and accuracy rises above the 0.39 of shipping everything, so the paid verdicts were not noise, and every row ships fewer correct answers, because every one withholds. F1 sees both sides. ACCEPT and strict voting give up eleven and six points of it to send half or more of the batch to a person; the loose check, loose voting and the blind judge land within about five points of shipping everything; only the menu-shown judge clears it, by two to three points on every run, for 84,000 tokens.</w:t>
       </w:r>
     </w:p>
     <w:p>

</xml_diff>